<commit_message>
Revised first paragraphs and sankey charts. Wrote intro paragraphs to the charts
</commit_message>
<xml_diff>
--- a/reports/template.docx
+++ b/reports/template.docx
@@ -4,7 +4,7 @@
   <w:body>
     <w:p>
       <w:pPr>
-        <w:pStyle w:val="Caption"/>
+        <w:pStyle w:val="FigureCaptionCustom"/>
       </w:pPr>
     </w:p>
     <w:sectPr>
@@ -1499,18 +1499,23 @@
     <w:uiPriority w:val="35"/>
     <w:unhideWhenUsed/>
     <w:qFormat/>
-    <w:rsid w:val="00305C7B"/>
+    <w:rsid w:val="002774C0"/>
     <w:pPr>
       <w:spacing w:after="200" w:line="240" w:lineRule="auto"/>
-    </w:pPr>
-    <w:rPr>
-      <w:rFonts w:ascii="Montserrat" w:hAnsi="Montserrat"/>
+      <w:jc w:val="center"/>
+    </w:pPr>
+    <w:rPr>
       <w:i/>
       <w:iCs/>
-      <w:color w:val="A6A6A6" w:themeColor="background1" w:themeShade="A6"/>
-      <w:sz w:val="21"/>
+      <w:sz w:val="20"/>
       <w:szCs w:val="18"/>
     </w:rPr>
+  </w:style>
+  <w:style w:type="paragraph" w:customStyle="1" w:styleId="FigureCaptionCustom">
+    <w:name w:val="FigureCaptionCustom"/>
+    <w:basedOn w:val="Caption"/>
+    <w:qFormat/>
+    <w:rsid w:val="0048758A"/>
   </w:style>
 </w:styles>
 </file>

</xml_diff>

<commit_message>
Added and formatted the TOC
</commit_message>
<xml_diff>
--- a/reports/template.docx
+++ b/reports/template.docx
@@ -4,7 +4,7 @@
   <w:body>
     <w:p>
       <w:pPr>
-        <w:pStyle w:val="FigureCaptionCustom"/>
+        <w:pStyle w:val="Heading1"/>
       </w:pPr>
     </w:p>
     <w:sectPr>
@@ -1517,6 +1517,23 @@
     <w:qFormat/>
     <w:rsid w:val="0048758A"/>
   </w:style>
+  <w:style w:type="paragraph" w:styleId="TOCHeading">
+    <w:name w:val="TOC Heading"/>
+    <w:basedOn w:val="Heading1"/>
+    <w:next w:val="Normal"/>
+    <w:uiPriority w:val="39"/>
+    <w:semiHidden/>
+    <w:unhideWhenUsed/>
+    <w:qFormat/>
+    <w:rsid w:val="005406A2"/>
+    <w:pPr>
+      <w:spacing w:before="240" w:after="0"/>
+      <w:outlineLvl w:val="9"/>
+    </w:pPr>
+    <w:rPr>
+      <w:szCs w:val="32"/>
+    </w:rPr>
+  </w:style>
 </w:styles>
 </file>
 

</xml_diff>

<commit_message>
REvised case studies and co-occurrence
</commit_message>
<xml_diff>
--- a/reports/template.docx
+++ b/reports/template.docx
@@ -4,7 +4,8 @@
   <w:body>
     <w:p>
       <w:pPr>
-        <w:pStyle w:val="Heading1"/>
+        <w:pStyle w:val="BlockText1"/>
+        <w:ind w:left="0"/>
       </w:pPr>
     </w:p>
     <w:sectPr>
@@ -1338,15 +1339,15 @@
     <w:link w:val="QuoteChar"/>
     <w:uiPriority w:val="29"/>
     <w:qFormat/>
-    <w:rsid w:val="00777336"/>
-    <w:pPr>
-      <w:spacing w:before="160"/>
-      <w:jc w:val="center"/>
+    <w:rsid w:val="00902CF8"/>
+    <w:pPr>
+      <w:ind w:left="720" w:right="720"/>
     </w:pPr>
     <w:rPr>
       <w:i/>
       <w:iCs/>
       <w:color w:val="404040" w:themeColor="text1" w:themeTint="BF"/>
+      <w:sz w:val="22"/>
     </w:rPr>
   </w:style>
   <w:style w:type="character" w:customStyle="1" w:styleId="QuoteChar">
@@ -1354,11 +1355,13 @@
     <w:basedOn w:val="DefaultParagraphFont"/>
     <w:link w:val="Quote"/>
     <w:uiPriority w:val="29"/>
-    <w:rsid w:val="00777336"/>
-    <w:rPr>
+    <w:rsid w:val="00902CF8"/>
+    <w:rPr>
+      <w:rFonts w:ascii="Times New Roman" w:hAnsi="Times New Roman"/>
       <w:i/>
       <w:iCs/>
       <w:color w:val="404040" w:themeColor="text1" w:themeTint="BF"/>
+      <w:sz w:val="22"/>
     </w:rPr>
   </w:style>
   <w:style w:type="paragraph" w:styleId="ListParagraph">
@@ -1532,6 +1535,21 @@
     </w:pPr>
     <w:rPr>
       <w:szCs w:val="32"/>
+    </w:rPr>
+  </w:style>
+  <w:style w:type="paragraph" w:customStyle="1" w:styleId="BlockText1">
+    <w:name w:val="Block Text1"/>
+    <w:basedOn w:val="Heading1"/>
+    <w:rsid w:val="00410898"/>
+    <w:pPr>
+      <w:spacing w:before="0" w:after="160"/>
+      <w:ind w:left="720" w:right="720"/>
+    </w:pPr>
+    <w:rPr>
+      <w:rFonts w:ascii="Times New Roman" w:hAnsi="Times New Roman"/>
+      <w:b w:val="0"/>
+      <w:i/>
+      <w:sz w:val="22"/>
     </w:rPr>
   </w:style>
 </w:styles>

</xml_diff>